<commit_message>
Criação do banco de dados e conetando com o VsCode
</commit_message>
<xml_diff>
--- a/VIA/docs/ProjetoVIAAtualizado.docx
+++ b/VIA/docs/ProjetoVIAAtualizado.docx
@@ -100,7 +100,7 @@
           <w:sz w:val="28"/>
           <w:szCs w:val="28"/>
         </w:rPr>
-        <w:t>Felipe Santos Rocha, Thiago Gonçalves, João Vitor Amaro, Henrico Taiete, Diogo e Jéssica</w:t>
+        <w:t>Felipe Santos Rocha, Thiago Gonçalves, João Vitor Amaro, Henrico Taiete, Diogo, Jéssica e Lucas Volbato</w:t>
       </w:r>
     </w:p>
     <w:p>
@@ -242,7 +242,7 @@
           <w:sz w:val="28"/>
           <w:szCs w:val="28"/>
         </w:rPr>
-        <w:t xml:space="preserve"> 1.2</w:t>
+        <w:t xml:space="preserve"> 1.3</w:t>
       </w:r>
     </w:p>
     <w:p>
@@ -345,12 +345,14 @@
       </w:r>
       <w:r>
         <w:rPr>
+          <w:b w:val="false"/>
+          <w:bCs w:val="false"/>
           <w:i/>
           <w:iCs/>
           <w:sz w:val="28"/>
           <w:szCs w:val="28"/>
         </w:rPr>
-        <w:t>Desenvolvedor Front-end</w:t>
+        <w:t>Desenvolvedor Arduino e I.A</w:t>
       </w:r>
     </w:p>
     <w:p>
@@ -526,6 +528,45 @@
     <w:p>
       <w:pPr>
         <w:pStyle w:val="BodyText"/>
+        <w:numPr>
+          <w:ilvl w:val="0"/>
+          <w:numId w:val="1"/>
+        </w:numPr>
+        <w:rPr>
+          <w:b/>
+          <w:bCs/>
+          <w:i/>
+          <w:iCs/>
+          <w:sz w:val="28"/>
+          <w:szCs w:val="28"/>
+        </w:rPr>
+      </w:pPr>
+      <w:r>
+        <w:rPr>
+          <w:b/>
+          <w:bCs/>
+          <w:i/>
+          <w:iCs/>
+          <w:sz w:val="28"/>
+          <w:szCs w:val="28"/>
+        </w:rPr>
+        <w:t>Lucas:</w:t>
+      </w:r>
+      <w:r>
+        <w:rPr>
+          <w:b w:val="false"/>
+          <w:bCs w:val="false"/>
+          <w:i/>
+          <w:iCs/>
+          <w:sz w:val="28"/>
+          <w:szCs w:val="28"/>
+        </w:rPr>
+        <w:t xml:space="preserve"> Desenvolvedor Arduino e I.A</w:t>
+      </w:r>
+    </w:p>
+    <w:p>
+      <w:pPr>
+        <w:pStyle w:val="BodyText"/>
         <w:ind w:start="720"/>
         <w:rPr>
           <w:b/>
@@ -574,9 +615,12 @@
     <w:p>
       <w:pPr>
         <w:pStyle w:val="Heading2"/>
+        <w:numPr>
+          <w:ilvl w:val="0"/>
+          <w:numId w:val="10"/>
+        </w:numPr>
         <w:spacing w:lineRule="auto" w:line="276" w:before="0" w:after="140"/>
         <w:rPr>
-          <w:rStyle w:val="Cdigo-fonteuser"/>
           <w:b w:val="false"/>
           <w:bCs w:val="false"/>
           <w:i/>
@@ -594,6 +638,183 @@
           <w:sz w:val="28"/>
           <w:szCs w:val="28"/>
         </w:rPr>
+        <w:t>#</w:t>
+      </w:r>
+      <w:r>
+        <w:rPr>
+          <w:b w:val="false"/>
+          <w:bCs w:val="false"/>
+          <w:i/>
+          <w:iCs/>
+          <w:color w:val="25D9B8"/>
+          <w:sz w:val="28"/>
+          <w:szCs w:val="28"/>
+        </w:rPr>
+        <w:t>25d9b8</w:t>
+      </w:r>
+    </w:p>
+    <w:p>
+      <w:pPr>
+        <w:pStyle w:val="BodyText"/>
+        <w:numPr>
+          <w:ilvl w:val="0"/>
+          <w:numId w:val="10"/>
+        </w:numPr>
+        <w:spacing w:lineRule="auto" w:line="276" w:before="0" w:after="140"/>
+        <w:rPr>
+          <w:b w:val="false"/>
+          <w:bCs w:val="false"/>
+          <w:i/>
+          <w:iCs/>
+          <w:sz w:val="28"/>
+          <w:szCs w:val="28"/>
+        </w:rPr>
+      </w:pPr>
+      <w:r>
+        <w:rPr>
+          <w:b w:val="false"/>
+          <w:bCs w:val="false"/>
+          <w:i/>
+          <w:iCs/>
+          <w:sz w:val="28"/>
+          <w:szCs w:val="28"/>
+        </w:rPr>
+        <w:t>#</w:t>
+      </w:r>
+      <w:r>
+        <w:rPr>
+          <w:b w:val="false"/>
+          <w:bCs w:val="false"/>
+          <w:i/>
+          <w:iCs/>
+          <w:color w:val="3ADF81"/>
+          <w:sz w:val="28"/>
+          <w:szCs w:val="28"/>
+        </w:rPr>
+        <w:t>3adf81</w:t>
+      </w:r>
+    </w:p>
+    <w:p>
+      <w:pPr>
+        <w:pStyle w:val="BodyText"/>
+        <w:numPr>
+          <w:ilvl w:val="0"/>
+          <w:numId w:val="10"/>
+        </w:numPr>
+        <w:spacing w:lineRule="auto" w:line="276" w:before="0" w:after="140"/>
+        <w:rPr>
+          <w:b w:val="false"/>
+          <w:bCs w:val="false"/>
+          <w:i/>
+          <w:iCs/>
+          <w:color w:val="232323"/>
+          <w:sz w:val="28"/>
+          <w:szCs w:val="28"/>
+        </w:rPr>
+      </w:pPr>
+      <w:r>
+        <w:rPr>
+          <w:b w:val="false"/>
+          <w:bCs w:val="false"/>
+          <w:i/>
+          <w:iCs/>
+          <w:color w:val="232323"/>
+          <w:sz w:val="28"/>
+          <w:szCs w:val="28"/>
+        </w:rPr>
+        <w:t>#232323</w:t>
+      </w:r>
+    </w:p>
+    <w:p>
+      <w:pPr>
+        <w:pStyle w:val="BodyText"/>
+        <w:numPr>
+          <w:ilvl w:val="0"/>
+          <w:numId w:val="10"/>
+        </w:numPr>
+        <w:spacing w:lineRule="auto" w:line="276" w:before="0" w:after="140"/>
+        <w:rPr>
+          <w:b w:val="false"/>
+          <w:bCs w:val="false"/>
+          <w:i/>
+          <w:iCs/>
+          <w:color w:val="515151"/>
+          <w:sz w:val="28"/>
+          <w:szCs w:val="28"/>
+          <w:highlight w:val="none"/>
+          <w:shd w:fill="FFFFFF" w:val="clear"/>
+        </w:rPr>
+      </w:pPr>
+      <w:r>
+        <w:rPr>
+          <w:b w:val="false"/>
+          <w:bCs w:val="false"/>
+          <w:i/>
+          <w:iCs/>
+          <w:color w:val="515151"/>
+          <w:sz w:val="28"/>
+          <w:szCs w:val="28"/>
+          <w:shd w:fill="FFFFFF" w:val="clear"/>
+        </w:rPr>
+        <w:t>#515151</w:t>
+      </w:r>
+    </w:p>
+    <w:p>
+      <w:pPr>
+        <w:pStyle w:val="BodyText"/>
+        <w:numPr>
+          <w:ilvl w:val="0"/>
+          <w:numId w:val="10"/>
+        </w:numPr>
+        <w:spacing w:lineRule="auto" w:line="276" w:before="0" w:after="140"/>
+        <w:rPr>
+          <w:b w:val="false"/>
+          <w:bCs w:val="false"/>
+          <w:i/>
+          <w:iCs/>
+          <w:color w:val="FFFFFF"/>
+          <w:sz w:val="28"/>
+          <w:szCs w:val="28"/>
+          <w:highlight w:val="none"/>
+          <w:shd w:fill="000000" w:val="clear"/>
+        </w:rPr>
+      </w:pPr>
+      <w:r>
+        <w:rPr>
+          <w:b w:val="false"/>
+          <w:bCs w:val="false"/>
+          <w:i/>
+          <w:iCs/>
+          <w:color w:val="FFFFFF"/>
+          <w:sz w:val="28"/>
+          <w:szCs w:val="28"/>
+          <w:shd w:fill="000000" w:val="clear"/>
+        </w:rPr>
+        <w:t>#ffffff</w:t>
+      </w:r>
+    </w:p>
+    <w:p>
+      <w:pPr>
+        <w:pStyle w:val="BodyText"/>
+        <w:spacing w:lineRule="auto" w:line="276" w:before="0" w:after="140"/>
+        <w:rPr>
+          <w:b w:val="false"/>
+          <w:bCs w:val="false"/>
+          <w:i/>
+          <w:iCs/>
+          <w:sz w:val="28"/>
+          <w:szCs w:val="28"/>
+        </w:rPr>
+      </w:pPr>
+      <w:r>
+        <w:rPr>
+          <w:b w:val="false"/>
+          <w:bCs w:val="false"/>
+          <w:i/>
+          <w:iCs/>
+          <w:sz w:val="28"/>
+          <w:szCs w:val="28"/>
+        </w:rPr>
       </w:r>
     </w:p>
     <w:p>
@@ -1148,7 +1369,7 @@
           <w:sz w:val="28"/>
           <w:szCs w:val="28"/>
         </w:rPr>
-        <w:t>Motorista ver qual motorista está dirigindo qual veículo (Opcional)</w:t>
+        <w:t xml:space="preserve">Motorista ver qual motorista está dirigindo qual veículo </w:t>
       </w:r>
     </w:p>
     <w:p>
@@ -1171,7 +1392,21 @@
           <w:sz w:val="28"/>
           <w:szCs w:val="28"/>
         </w:rPr>
-        <w:t>Análise das infrações para Detran (Opcional)</w:t>
+        <w:t xml:space="preserve">Uma Câmera para detecção de vagas  </w:t>
+      </w:r>
+      <w:r>
+        <w:rPr>
+          <w:sz w:val="28"/>
+          <w:szCs w:val="28"/>
+        </w:rPr>
+        <w:t xml:space="preserve">e veiculos </w:t>
+      </w:r>
+      <w:r>
+        <w:rPr>
+          <w:sz w:val="28"/>
+          <w:szCs w:val="28"/>
+        </w:rPr>
+        <w:t xml:space="preserve">com uma IA </w:t>
       </w:r>
     </w:p>
     <w:p>
@@ -1194,24 +1429,7 @@
           <w:sz w:val="28"/>
           <w:szCs w:val="28"/>
         </w:rPr>
-        <w:t>API do Detran, caso houver infração (Opcional)</w:t>
-      </w:r>
-    </w:p>
-    <w:p>
-      <w:pPr>
-        <w:pStyle w:val="Heading2"/>
-        <w:spacing w:lineRule="auto" w:line="276" w:before="0" w:after="140"/>
-        <w:rPr>
-          <w:sz w:val="40"/>
-          <w:szCs w:val="40"/>
-        </w:rPr>
-      </w:pPr>
-      <w:r>
-        <w:rPr>
-          <w:sz w:val="40"/>
-          <w:szCs w:val="40"/>
-        </w:rPr>
-        <w:t>6.2 O que o sistema NÃO vai fazer (Fora do escopo)</w:t>
+        <w:t>Análise das infrações para Detran (Opcional)</w:t>
       </w:r>
     </w:p>
     <w:p>
@@ -1234,7 +1452,24 @@
           <w:sz w:val="28"/>
           <w:szCs w:val="28"/>
         </w:rPr>
-        <w:t>Não realizará pagamento de multas automaticamente.</w:t>
+        <w:t>API do Detran, caso houver infração (Opcional)</w:t>
+      </w:r>
+    </w:p>
+    <w:p>
+      <w:pPr>
+        <w:pStyle w:val="Heading2"/>
+        <w:spacing w:lineRule="auto" w:line="276" w:before="0" w:after="140"/>
+        <w:rPr>
+          <w:sz w:val="40"/>
+          <w:szCs w:val="40"/>
+        </w:rPr>
+      </w:pPr>
+      <w:r>
+        <w:rPr>
+          <w:sz w:val="40"/>
+          <w:szCs w:val="40"/>
+        </w:rPr>
+        <w:t>6.2 O que o sistema NÃO vai fazer (Fora do escopo)</w:t>
       </w:r>
     </w:p>
     <w:p>
@@ -1257,7 +1492,7 @@
           <w:sz w:val="28"/>
           <w:szCs w:val="28"/>
         </w:rPr>
-        <w:t>Não substituirá sistemas oficiais do DETRAN.</w:t>
+        <w:t>Não realizará pagamento de multas automaticamente.</w:t>
       </w:r>
     </w:p>
     <w:p>
@@ -1280,7 +1515,7 @@
           <w:sz w:val="28"/>
           <w:szCs w:val="28"/>
         </w:rPr>
-        <w:t>Não fará controle físico de cancelas.</w:t>
+        <w:t>Não substituirá sistemas oficiais do DETRAN.</w:t>
       </w:r>
     </w:p>
     <w:p>
@@ -1303,7 +1538,7 @@
           <w:sz w:val="28"/>
           <w:szCs w:val="28"/>
         </w:rPr>
-        <w:t>Não terá aplicativo mobile nativo (apenas aplicação web responsiva).</w:t>
+        <w:t>Não fará controle físico de cancelas.</w:t>
       </w:r>
     </w:p>
     <w:p>
@@ -1326,7 +1561,7 @@
           <w:sz w:val="28"/>
           <w:szCs w:val="28"/>
         </w:rPr>
-        <w:t>Não fará reconhecimento automático de placas (OCR).</w:t>
+        <w:t>Não terá aplicativo mobile nativo (apenas aplicação web responsiva).</w:t>
       </w:r>
     </w:p>
     <w:p>
@@ -1349,7 +1584,7 @@
           <w:sz w:val="28"/>
           <w:szCs w:val="28"/>
         </w:rPr>
-        <w:t>Não terá integração com sistema bancário.</w:t>
+        <w:t>Não fará reconhecimento automático de placas (OCR).</w:t>
       </w:r>
     </w:p>
     <w:p>
@@ -1372,7 +1607,7 @@
           <w:sz w:val="28"/>
           <w:szCs w:val="28"/>
         </w:rPr>
-        <w:t>Não será responsável por fiscalização presencial.</w:t>
+        <w:t>Não terá integração com sistema bancário.</w:t>
       </w:r>
     </w:p>
     <w:p>
@@ -1395,7 +1630,7 @@
           <w:sz w:val="28"/>
           <w:szCs w:val="28"/>
         </w:rPr>
-        <w:t>Não terá monitoramento por câmeras.</w:t>
+        <w:t>Não será responsável por fiscalização presencial.</w:t>
       </w:r>
     </w:p>
     <w:p>
@@ -1456,7 +1691,7 @@
         <w:pStyle w:val="BodyText"/>
         <w:numPr>
           <w:ilvl w:val="0"/>
-          <w:numId w:val="11"/>
+          <w:numId w:val="12"/>
         </w:numPr>
         <w:tabs>
           <w:tab w:val="clear" w:pos="709"/>
@@ -1747,6 +1982,26 @@
       <w:pPr>
         <w:pStyle w:val="BodyText"/>
         <w:rPr>
+          <w:b w:val="false"/>
+          <w:bCs w:val="false"/>
+          <w:sz w:val="28"/>
+          <w:szCs w:val="28"/>
+        </w:rPr>
+      </w:pPr>
+      <w:r>
+        <w:rPr>
+          <w:b/>
+          <w:bCs/>
+          <w:sz w:val="28"/>
+          <w:szCs w:val="28"/>
+        </w:rPr>
+        <w:t>RN08 -  A câmera detectar a presença de veiculos em conjunto com a placa do veiculo</w:t>
+      </w:r>
+    </w:p>
+    <w:p>
+      <w:pPr>
+        <w:pStyle w:val="BodyText"/>
+        <w:rPr>
           <w:b/>
           <w:bCs/>
           <w:sz w:val="28"/>
@@ -2081,6 +2336,25 @@
           <w:szCs w:val="28"/>
         </w:rPr>
         <w:t>O Sistema deve integrar com API do Google Maps</w:t>
+      </w:r>
+    </w:p>
+    <w:p>
+      <w:pPr>
+        <w:pStyle w:val="BodyText"/>
+        <w:rPr>
+          <w:b/>
+          <w:bCs/>
+          <w:sz w:val="28"/>
+          <w:szCs w:val="28"/>
+        </w:rPr>
+      </w:pPr>
+      <w:r>
+        <w:rPr>
+          <w:b/>
+          <w:bCs/>
+          <w:sz w:val="28"/>
+          <w:szCs w:val="28"/>
+        </w:rPr>
       </w:r>
     </w:p>
     <w:p>
@@ -2380,6 +2654,105 @@
           <w:sz w:val="28"/>
           <w:szCs w:val="28"/>
         </w:rPr>
+        <w:t>HU5</w:t>
+      </w:r>
+    </w:p>
+    <w:p>
+      <w:pPr>
+        <w:pStyle w:val="BodyText"/>
+        <w:rPr>
+          <w:b/>
+          <w:bCs/>
+          <w:sz w:val="28"/>
+          <w:szCs w:val="28"/>
+        </w:rPr>
+      </w:pPr>
+      <w:r>
+        <w:rPr>
+          <w:b/>
+          <w:bCs/>
+          <w:sz w:val="28"/>
+          <w:szCs w:val="28"/>
+        </w:rPr>
+        <w:t>Como empresa</w:t>
+      </w:r>
+    </w:p>
+    <w:p>
+      <w:pPr>
+        <w:pStyle w:val="BodyText"/>
+        <w:rPr>
+          <w:b/>
+          <w:bCs/>
+          <w:sz w:val="28"/>
+          <w:szCs w:val="28"/>
+        </w:rPr>
+      </w:pPr>
+      <w:r>
+        <w:rPr>
+          <w:b/>
+          <w:bCs/>
+          <w:sz w:val="28"/>
+          <w:szCs w:val="28"/>
+        </w:rPr>
+        <w:t>Gostaria de saber qual funcionario está dirigindo qual veiculo</w:t>
+      </w:r>
+    </w:p>
+    <w:p>
+      <w:pPr>
+        <w:pStyle w:val="BodyText"/>
+        <w:rPr>
+          <w:b/>
+          <w:bCs/>
+          <w:sz w:val="28"/>
+          <w:szCs w:val="28"/>
+        </w:rPr>
+      </w:pPr>
+      <w:r>
+        <w:rPr>
+          <w:b/>
+          <w:bCs/>
+          <w:sz w:val="28"/>
+          <w:szCs w:val="28"/>
+        </w:rPr>
+        <w:t>HU6</w:t>
+      </w:r>
+    </w:p>
+    <w:p>
+      <w:pPr>
+        <w:pStyle w:val="BodyText"/>
+        <w:rPr>
+          <w:b/>
+          <w:bCs/>
+          <w:sz w:val="28"/>
+          <w:szCs w:val="28"/>
+        </w:rPr>
+      </w:pPr>
+      <w:r>
+        <w:rPr>
+          <w:b/>
+          <w:bCs/>
+          <w:sz w:val="28"/>
+          <w:szCs w:val="28"/>
+        </w:rPr>
+      </w:r>
+    </w:p>
+    <w:p>
+      <w:pPr>
+        <w:pStyle w:val="BodyText"/>
+        <w:rPr>
+          <w:b/>
+          <w:bCs/>
+          <w:sz w:val="28"/>
+          <w:szCs w:val="28"/>
+        </w:rPr>
+      </w:pPr>
+      <w:r>
+        <w:rPr>
+          <w:b/>
+          <w:bCs/>
+          <w:sz w:val="28"/>
+          <w:szCs w:val="28"/>
+        </w:rPr>
       </w:r>
     </w:p>
     <w:p>
@@ -2436,7 +2809,43 @@
         <w:br/>
         <w:t>CA02 – O sistema não deve permitir CNPJ duplicado.</w:t>
         <w:br/>
-        <w:t>CA03 – O sistema deve exigir senha mínima de 6 caracteres.</w:t>
+        <w:t xml:space="preserve">CA03 – O sistema deve exigir senha mínima de </w:t>
+      </w:r>
+      <w:r>
+        <w:rPr>
+          <w:b/>
+          <w:bCs/>
+          <w:sz w:val="28"/>
+          <w:szCs w:val="28"/>
+        </w:rPr>
+        <w:t>12</w:t>
+      </w:r>
+      <w:r>
+        <w:rPr>
+          <w:b/>
+          <w:bCs/>
+          <w:sz w:val="28"/>
+          <w:szCs w:val="28"/>
+        </w:rPr>
+        <w:t xml:space="preserve"> caracteres </w:t>
+      </w:r>
+      <w:r>
+        <w:rPr>
+          <w:b/>
+          <w:bCs/>
+          <w:sz w:val="28"/>
+          <w:szCs w:val="28"/>
+        </w:rPr>
+        <w:t>+ numeros + charecters especiais</w:t>
+      </w:r>
+      <w:r>
+        <w:rPr>
+          <w:b/>
+          <w:bCs/>
+          <w:sz w:val="28"/>
+          <w:szCs w:val="28"/>
+        </w:rPr>
+        <w:t>.</w:t>
       </w:r>
     </w:p>
     <w:p>
@@ -2832,21 +3241,7 @@
           <w:sz w:val="44"/>
           <w:szCs w:val="44"/>
         </w:rPr>
-        <w:t>1</w:t>
-      </w:r>
-      <w:r>
-        <w:rPr>
-          <w:sz w:val="44"/>
-          <w:szCs w:val="44"/>
-        </w:rPr>
-        <w:t>1</w:t>
-      </w:r>
-      <w:r>
-        <w:rPr>
-          <w:sz w:val="44"/>
-          <w:szCs w:val="44"/>
-        </w:rPr>
-        <w:t>. STACK TECNOLÓGICA (TECNOLOGIAS)</w:t>
+        <w:t>11. STACK TECNOLÓGICA (TECNOLOGIAS)</w:t>
       </w:r>
     </w:p>
     <w:p>
@@ -4391,7 +4786,7 @@
         <w:ind w:start="1080" w:hanging="360"/>
       </w:pPr>
       <w:rPr>
-        <w:rFonts w:cs="Symbol"/>
+        <w:rFonts w:ascii="Liberation Serif" w:hAnsi="Liberation Serif" w:cs="Symbol"/>
         <w:sz w:val="28"/>
         <w:szCs w:val="28"/>
       </w:rPr>
@@ -4408,7 +4803,7 @@
         <w:ind w:start="1440" w:hanging="360"/>
       </w:pPr>
       <w:rPr>
-        <w:rFonts w:cs="Symbol"/>
+        <w:rFonts w:ascii="Liberation Serif" w:hAnsi="Liberation Serif" w:cs="Symbol"/>
         <w:sz w:val="28"/>
         <w:szCs w:val="28"/>
       </w:rPr>
@@ -4425,7 +4820,7 @@
         <w:ind w:start="1800" w:hanging="360"/>
       </w:pPr>
       <w:rPr>
-        <w:rFonts w:cs="Symbol"/>
+        <w:rFonts w:ascii="Liberation Serif" w:hAnsi="Liberation Serif" w:cs="Symbol"/>
         <w:sz w:val="28"/>
         <w:szCs w:val="28"/>
       </w:rPr>
@@ -4442,7 +4837,7 @@
         <w:ind w:start="2160" w:hanging="360"/>
       </w:pPr>
       <w:rPr>
-        <w:rFonts w:cs="Symbol"/>
+        <w:rFonts w:ascii="Liberation Serif" w:hAnsi="Liberation Serif" w:cs="Symbol"/>
         <w:sz w:val="28"/>
         <w:szCs w:val="28"/>
       </w:rPr>
@@ -4459,7 +4854,7 @@
         <w:ind w:start="2520" w:hanging="360"/>
       </w:pPr>
       <w:rPr>
-        <w:rFonts w:cs="Symbol"/>
+        <w:rFonts w:ascii="Liberation Serif" w:hAnsi="Liberation Serif" w:cs="Symbol"/>
         <w:sz w:val="28"/>
         <w:szCs w:val="28"/>
       </w:rPr>
@@ -4476,7 +4871,7 @@
         <w:ind w:start="2880" w:hanging="360"/>
       </w:pPr>
       <w:rPr>
-        <w:rFonts w:cs="Symbol"/>
+        <w:rFonts w:ascii="Liberation Serif" w:hAnsi="Liberation Serif" w:cs="Symbol"/>
         <w:sz w:val="28"/>
         <w:szCs w:val="28"/>
       </w:rPr>
@@ -4493,7 +4888,7 @@
         <w:ind w:start="3240" w:hanging="360"/>
       </w:pPr>
       <w:rPr>
-        <w:rFonts w:cs="Symbol"/>
+        <w:rFonts w:ascii="Liberation Serif" w:hAnsi="Liberation Serif" w:cs="Symbol"/>
         <w:sz w:val="28"/>
         <w:szCs w:val="28"/>
       </w:rPr>
@@ -4510,13 +4905,150 @@
         <w:ind w:start="3600" w:hanging="360"/>
       </w:pPr>
       <w:rPr>
-        <w:rFonts w:cs="Symbol"/>
+        <w:rFonts w:ascii="Liberation Serif" w:hAnsi="Liberation Serif" w:cs="Symbol"/>
         <w:sz w:val="28"/>
         <w:szCs w:val="28"/>
       </w:rPr>
     </w:lvl>
   </w:abstractNum>
   <w:abstractNum w:abstractNumId="10">
+    <w:lvl w:ilvl="0">
+      <w:start w:val="1"/>
+      <w:numFmt w:val="bullet"/>
+      <w:lvlText w:val=""/>
+      <w:lvlJc w:val="start"/>
+      <w:pPr>
+        <w:tabs>
+          <w:tab w:val="num" w:pos="720"/>
+        </w:tabs>
+        <w:ind w:start="720" w:hanging="360"/>
+      </w:pPr>
+      <w:rPr>
+        <w:rFonts w:ascii="Symbol" w:hAnsi="Symbol" w:cs="Symbol" w:hint="default"/>
+      </w:rPr>
+    </w:lvl>
+    <w:lvl w:ilvl="1">
+      <w:start w:val="1"/>
+      <w:numFmt w:val="bullet"/>
+      <w:lvlText w:val="◦"/>
+      <w:lvlJc w:val="start"/>
+      <w:pPr>
+        <w:tabs>
+          <w:tab w:val="num" w:pos="1080"/>
+        </w:tabs>
+        <w:ind w:start="1080" w:hanging="360"/>
+      </w:pPr>
+      <w:rPr>
+        <w:rFonts w:ascii="OpenSymbol" w:hAnsi="OpenSymbol" w:cs="OpenSymbol" w:hint="default"/>
+      </w:rPr>
+    </w:lvl>
+    <w:lvl w:ilvl="2">
+      <w:start w:val="1"/>
+      <w:numFmt w:val="bullet"/>
+      <w:lvlText w:val="▪"/>
+      <w:lvlJc w:val="start"/>
+      <w:pPr>
+        <w:tabs>
+          <w:tab w:val="num" w:pos="1440"/>
+        </w:tabs>
+        <w:ind w:start="1440" w:hanging="360"/>
+      </w:pPr>
+      <w:rPr>
+        <w:rFonts w:ascii="OpenSymbol" w:hAnsi="OpenSymbol" w:cs="OpenSymbol" w:hint="default"/>
+      </w:rPr>
+    </w:lvl>
+    <w:lvl w:ilvl="3">
+      <w:start w:val="1"/>
+      <w:numFmt w:val="bullet"/>
+      <w:lvlText w:val=""/>
+      <w:lvlJc w:val="start"/>
+      <w:pPr>
+        <w:tabs>
+          <w:tab w:val="num" w:pos="1800"/>
+        </w:tabs>
+        <w:ind w:start="1800" w:hanging="360"/>
+      </w:pPr>
+      <w:rPr>
+        <w:rFonts w:ascii="Symbol" w:hAnsi="Symbol" w:cs="Symbol" w:hint="default"/>
+      </w:rPr>
+    </w:lvl>
+    <w:lvl w:ilvl="4">
+      <w:start w:val="1"/>
+      <w:numFmt w:val="bullet"/>
+      <w:lvlText w:val="◦"/>
+      <w:lvlJc w:val="start"/>
+      <w:pPr>
+        <w:tabs>
+          <w:tab w:val="num" w:pos="2160"/>
+        </w:tabs>
+        <w:ind w:start="2160" w:hanging="360"/>
+      </w:pPr>
+      <w:rPr>
+        <w:rFonts w:ascii="OpenSymbol" w:hAnsi="OpenSymbol" w:cs="OpenSymbol" w:hint="default"/>
+      </w:rPr>
+    </w:lvl>
+    <w:lvl w:ilvl="5">
+      <w:start w:val="1"/>
+      <w:numFmt w:val="bullet"/>
+      <w:lvlText w:val="▪"/>
+      <w:lvlJc w:val="start"/>
+      <w:pPr>
+        <w:tabs>
+          <w:tab w:val="num" w:pos="2520"/>
+        </w:tabs>
+        <w:ind w:start="2520" w:hanging="360"/>
+      </w:pPr>
+      <w:rPr>
+        <w:rFonts w:ascii="OpenSymbol" w:hAnsi="OpenSymbol" w:cs="OpenSymbol" w:hint="default"/>
+      </w:rPr>
+    </w:lvl>
+    <w:lvl w:ilvl="6">
+      <w:start w:val="1"/>
+      <w:numFmt w:val="bullet"/>
+      <w:lvlText w:val=""/>
+      <w:lvlJc w:val="start"/>
+      <w:pPr>
+        <w:tabs>
+          <w:tab w:val="num" w:pos="2880"/>
+        </w:tabs>
+        <w:ind w:start="2880" w:hanging="360"/>
+      </w:pPr>
+      <w:rPr>
+        <w:rFonts w:ascii="Symbol" w:hAnsi="Symbol" w:cs="Symbol" w:hint="default"/>
+      </w:rPr>
+    </w:lvl>
+    <w:lvl w:ilvl="7">
+      <w:start w:val="1"/>
+      <w:numFmt w:val="bullet"/>
+      <w:lvlText w:val="◦"/>
+      <w:lvlJc w:val="start"/>
+      <w:pPr>
+        <w:tabs>
+          <w:tab w:val="num" w:pos="3240"/>
+        </w:tabs>
+        <w:ind w:start="3240" w:hanging="360"/>
+      </w:pPr>
+      <w:rPr>
+        <w:rFonts w:ascii="OpenSymbol" w:hAnsi="OpenSymbol" w:cs="OpenSymbol" w:hint="default"/>
+      </w:rPr>
+    </w:lvl>
+    <w:lvl w:ilvl="8">
+      <w:start w:val="1"/>
+      <w:numFmt w:val="bullet"/>
+      <w:lvlText w:val="▪"/>
+      <w:lvlJc w:val="start"/>
+      <w:pPr>
+        <w:tabs>
+          <w:tab w:val="num" w:pos="3600"/>
+        </w:tabs>
+        <w:ind w:start="3600" w:hanging="360"/>
+      </w:pPr>
+      <w:rPr>
+        <w:rFonts w:ascii="OpenSymbol" w:hAnsi="OpenSymbol" w:cs="OpenSymbol" w:hint="default"/>
+      </w:rPr>
+    </w:lvl>
+  </w:abstractNum>
+  <w:abstractNum w:abstractNumId="11">
     <w:lvl w:ilvl="0">
       <w:start w:val="1"/>
       <w:numFmt w:val="none"/>
@@ -4666,8 +5198,12 @@
     <w:abstractNumId w:val="10"/>
   </w:num>
   <w:num w:numId="11">
+    <w:abstractNumId w:val="11"/>
+  </w:num>
+  <w:num w:numId="12">
     <w:abstractNumId w:val="5"/>
     <w:lvlOverride w:ilvl="0">
+      <w:startOverride w:val="1"/>
       <w:lvl w:ilvl="0">
         <w:start w:val="1"/>
         <w:numFmt w:val="bullet"/>
@@ -4685,7 +5221,6 @@
           <w:szCs w:val="28"/>
         </w:rPr>
       </w:lvl>
-      <w:startOverride w:val="1"/>
     </w:lvlOverride>
     <w:lvlOverride w:ilvl="0">
       <w:startOverride w:val="1"/>
@@ -4703,7 +5238,7 @@
           <w:ind w:start="1080" w:hanging="360"/>
         </w:pPr>
         <w:rPr>
-          <w:rFonts w:cs="Symbol"/>
+          <w:rFonts w:ascii="Liberation Serif" w:hAnsi="Liberation Serif" w:cs="Symbol"/>
           <w:sz w:val="28"/>
           <w:szCs w:val="28"/>
         </w:rPr>
@@ -4725,7 +5260,7 @@
           <w:ind w:start="1440" w:hanging="360"/>
         </w:pPr>
         <w:rPr>
-          <w:rFonts w:cs="Symbol"/>
+          <w:rFonts w:ascii="Liberation Serif" w:hAnsi="Liberation Serif" w:cs="Symbol"/>
           <w:sz w:val="28"/>
           <w:szCs w:val="28"/>
         </w:rPr>
@@ -4747,7 +5282,7 @@
           <w:ind w:start="1800" w:hanging="360"/>
         </w:pPr>
         <w:rPr>
-          <w:rFonts w:cs="Symbol"/>
+          <w:rFonts w:ascii="Liberation Serif" w:hAnsi="Liberation Serif" w:cs="Symbol"/>
           <w:sz w:val="28"/>
           <w:szCs w:val="28"/>
         </w:rPr>
@@ -4769,7 +5304,7 @@
           <w:ind w:start="2160" w:hanging="360"/>
         </w:pPr>
         <w:rPr>
-          <w:rFonts w:cs="Symbol"/>
+          <w:rFonts w:ascii="Liberation Serif" w:hAnsi="Liberation Serif" w:cs="Symbol"/>
           <w:sz w:val="28"/>
           <w:szCs w:val="28"/>
         </w:rPr>
@@ -4791,7 +5326,7 @@
           <w:ind w:start="2520" w:hanging="360"/>
         </w:pPr>
         <w:rPr>
-          <w:rFonts w:cs="Symbol"/>
+          <w:rFonts w:ascii="Liberation Serif" w:hAnsi="Liberation Serif" w:cs="Symbol"/>
           <w:sz w:val="28"/>
           <w:szCs w:val="28"/>
         </w:rPr>
@@ -4813,7 +5348,7 @@
           <w:ind w:start="2880" w:hanging="360"/>
         </w:pPr>
         <w:rPr>
-          <w:rFonts w:cs="Symbol"/>
+          <w:rFonts w:ascii="Liberation Serif" w:hAnsi="Liberation Serif" w:cs="Symbol"/>
           <w:sz w:val="28"/>
           <w:szCs w:val="28"/>
         </w:rPr>
@@ -4835,7 +5370,7 @@
           <w:ind w:start="3240" w:hanging="360"/>
         </w:pPr>
         <w:rPr>
-          <w:rFonts w:cs="Symbol"/>
+          <w:rFonts w:ascii="Liberation Serif" w:hAnsi="Liberation Serif" w:cs="Symbol"/>
           <w:sz w:val="28"/>
           <w:szCs w:val="28"/>
         </w:rPr>
@@ -4857,7 +5392,7 @@
           <w:ind w:start="3600" w:hanging="360"/>
         </w:pPr>
         <w:rPr>
-          <w:rFonts w:cs="Symbol"/>
+          <w:rFonts w:ascii="Liberation Serif" w:hAnsi="Liberation Serif" w:cs="Symbol"/>
           <w:sz w:val="28"/>
           <w:szCs w:val="28"/>
         </w:rPr>
@@ -5395,6 +5930,13 @@
       <w:rFonts w:ascii="Liberation Mono" w:hAnsi="Liberation Mono" w:eastAsia="Liberation Mono" w:cs="Liberation Mono"/>
     </w:rPr>
   </w:style>
+  <w:style w:type="character" w:styleId="Marcadores">
+    <w:name w:val="Marcadores"/>
+    <w:qFormat/>
+    <w:rPr>
+      <w:rFonts w:ascii="OpenSymbol" w:hAnsi="OpenSymbol" w:eastAsia="OpenSymbol" w:cs="OpenSymbol"/>
+    </w:rPr>
+  </w:style>
   <w:style w:type="paragraph" w:styleId="Ttulo">
     <w:name w:val="Título"/>
     <w:basedOn w:val="Normal"/>
@@ -5464,6 +6006,21 @@
       <w:szCs w:val="28"/>
     </w:rPr>
   </w:style>
+  <w:style w:type="paragraph" w:styleId="Ttulouser">
+    <w:name w:val="Título (user)"/>
+    <w:basedOn w:val="Normal"/>
+    <w:next w:val="BodyText"/>
+    <w:qFormat/>
+    <w:pPr>
+      <w:keepNext w:val="true"/>
+      <w:spacing w:before="240" w:after="120"/>
+    </w:pPr>
+    <w:rPr>
+      <w:rFonts w:ascii="Liberation Sans" w:hAnsi="Liberation Sans" w:eastAsia="Noto Sans" w:cs="FreeSans"/>
+      <w:sz w:val="28"/>
+      <w:szCs w:val="28"/>
+    </w:rPr>
+  </w:style>
   <w:style w:type="paragraph" w:styleId="ndiceuser" w:customStyle="1">
     <w:name w:val="Índice (user)"/>
     <w:basedOn w:val="Normal"/>
@@ -5522,37 +6079,37 @@
         <a:srgbClr val="000000"/>
       </a:dk1>
       <a:lt1>
-        <a:srgbClr val="ffffff"/>
+        <a:srgbClr val="FFFFFF"/>
       </a:lt1>
       <a:dk2>
         <a:srgbClr val="000000"/>
       </a:dk2>
       <a:lt2>
-        <a:srgbClr val="ffffff"/>
+        <a:srgbClr val="FFFFFF"/>
       </a:lt2>
       <a:accent1>
-        <a:srgbClr val="18a303"/>
+        <a:srgbClr val="18A303"/>
       </a:accent1>
       <a:accent2>
-        <a:srgbClr val="0369a3"/>
+        <a:srgbClr val="0369A3"/>
       </a:accent2>
       <a:accent3>
-        <a:srgbClr val="a33e03"/>
+        <a:srgbClr val="A33E03"/>
       </a:accent3>
       <a:accent4>
-        <a:srgbClr val="8e03a3"/>
+        <a:srgbClr val="8E03A3"/>
       </a:accent4>
       <a:accent5>
-        <a:srgbClr val="c99c00"/>
+        <a:srgbClr val="C99C00"/>
       </a:accent5>
       <a:accent6>
-        <a:srgbClr val="c9211e"/>
+        <a:srgbClr val="C9211E"/>
       </a:accent6>
       <a:hlink>
-        <a:srgbClr val="0000ee"/>
+        <a:srgbClr val="0000EE"/>
       </a:hlink>
       <a:folHlink>
-        <a:srgbClr val="551a8b"/>
+        <a:srgbClr val="551A8B"/>
       </a:folHlink>
     </a:clrScheme>
     <a:fontScheme name="Office">

</xml_diff>